<commit_message>
Refine defect annotation reports and frontend workflows
</commit_message>
<xml_diff>
--- a/backend/templates/reports/正式报告示例.docx
+++ b/backend/templates/reports/正式报告示例.docx
@@ -6,6 +6,8 @@
       <w:pPr>
         <w:jc w:val="center"/>
       </w:pPr>
+      <w:bookmarkStart w:id="0" w:name="_GoBack"/>
+      <w:bookmarkEnd w:id="0"/>
       <w:r>
         <w:drawing>
           <wp:inline distT="0" distB="0" distL="114300" distR="114300">
@@ -75,7 +77,7 @@
     <w:tbl>
       <w:tblPr>
         <w:tblStyle w:val="32"/>
-        <w:tblW w:w="0" w:type="auto"/>
+        <w:tblW w:w="10033" w:type="dxa"/>
         <w:tblInd w:w="0" w:type="dxa"/>
         <w:tblBorders>
           <w:top w:val="single" w:color="000000" w:sz="4" w:space="0"/>
@@ -85,7 +87,7 @@
           <w:insideH w:val="single" w:color="000000" w:sz="4" w:space="0"/>
           <w:insideV w:val="single" w:color="000000" w:sz="4" w:space="0"/>
         </w:tblBorders>
-        <w:tblLayout w:type="autofit"/>
+        <w:tblLayout w:type="fixed"/>
         <w:tblCellMar>
           <w:top w:w="0" w:type="dxa"/>
           <w:left w:w="108" w:type="dxa"/>
@@ -95,10 +97,11 @@
       </w:tblPr>
       <w:tblGrid>
         <w:gridCol w:w="526"/>
-        <w:gridCol w:w="2766"/>
-        <w:gridCol w:w="2766"/>
-        <w:gridCol w:w="1384"/>
-        <w:gridCol w:w="1414"/>
+        <w:gridCol w:w="2548"/>
+        <w:gridCol w:w="2546"/>
+        <w:gridCol w:w="1090"/>
+        <w:gridCol w:w="1864"/>
+        <w:gridCol w:w="1459"/>
       </w:tblGrid>
       <w:tr>
         <w:tblPrEx>
@@ -137,7 +140,7 @@
         </w:tc>
         <w:tc>
           <w:tcPr>
-            <w:tcW w:w="2766" w:type="dxa"/>
+            <w:tcW w:w="2548" w:type="dxa"/>
           </w:tcPr>
           <w:p>
             <w:pPr>
@@ -155,7 +158,7 @@
         </w:tc>
         <w:tc>
           <w:tcPr>
-            <w:tcW w:w="2766" w:type="dxa"/>
+            <w:tcW w:w="2546" w:type="dxa"/>
           </w:tcPr>
           <w:p>
             <w:pPr>
@@ -173,25 +176,7 @@
         </w:tc>
         <w:tc>
           <w:tcPr>
-            <w:tcW w:w="1384" w:type="dxa"/>
-          </w:tcPr>
-          <w:p>
-            <w:pPr>
-              <w:jc w:val="center"/>
-            </w:pPr>
-            <w:r>
-              <w:rPr>
-                <w:rFonts w:ascii="宋体" w:hAnsi="宋体" w:eastAsia="宋体"/>
-                <w:b/>
-                <w:sz w:val="21"/>
-              </w:rPr>
-              <w:t>说明</w:t>
-            </w:r>
-          </w:p>
-        </w:tc>
-        <w:tc>
-          <w:tcPr>
-            <w:tcW w:w="1414" w:type="dxa"/>
+            <w:tcW w:w="1090" w:type="dxa"/>
           </w:tcPr>
           <w:p>
             <w:pPr>
@@ -220,6 +205,57 @@
                 <w:sz w:val="21"/>
               </w:rPr>
               <w:t>拍摄高度</w:t>
+            </w:r>
+          </w:p>
+        </w:tc>
+        <w:tc>
+          <w:tcPr>
+            <w:tcW w:w="1864" w:type="dxa"/>
+          </w:tcPr>
+          <w:p>
+            <w:pPr>
+              <w:jc w:val="center"/>
+            </w:pPr>
+            <w:r>
+              <w:rPr>
+                <w:rFonts w:ascii="宋体" w:hAnsi="宋体" w:eastAsia="宋体"/>
+                <w:b/>
+                <w:sz w:val="21"/>
+              </w:rPr>
+              <w:t>说明</w:t>
+            </w:r>
+          </w:p>
+        </w:tc>
+        <w:tc>
+          <w:tcPr>
+            <w:tcW w:w="1459" w:type="dxa"/>
+          </w:tcPr>
+          <w:p>
+            <w:pPr>
+              <w:jc w:val="center"/>
+              <w:rPr>
+                <w:rFonts w:hint="eastAsia" w:ascii="宋体" w:hAnsi="宋体" w:eastAsia="宋体"/>
+                <w:b/>
+                <w:sz w:val="21"/>
+                <w:lang w:val="en-US" w:eastAsia="zh-CN"/>
+              </w:rPr>
+            </w:pPr>
+            <w:r>
+              <w:rPr>
+                <w:rFonts w:hint="eastAsia" w:ascii="宋体" w:hAnsi="宋体" w:eastAsia="宋体"/>
+                <w:b/>
+                <w:sz w:val="21"/>
+              </w:rPr>
+              <w:t>缺陷</w:t>
+            </w:r>
+            <w:r>
+              <w:rPr>
+                <w:rFonts w:hint="eastAsia" w:ascii="宋体" w:hAnsi="宋体" w:eastAsia="宋体"/>
+                <w:b/>
+                <w:sz w:val="21"/>
+                <w:lang w:val="en-US" w:eastAsia="zh-CN"/>
+              </w:rPr>
+              <w:t>详情</w:t>
             </w:r>
           </w:p>
         </w:tc>
@@ -260,7 +296,7 @@
         </w:tc>
         <w:tc>
           <w:tcPr>
-            <w:tcW w:w="2766" w:type="dxa"/>
+            <w:tcW w:w="2548" w:type="dxa"/>
           </w:tcPr>
           <w:p>
             <w:pPr>
@@ -269,8 +305,8 @@
             <w:r>
               <w:drawing>
                 <wp:inline distT="0" distB="0" distL="114300" distR="114300">
-                  <wp:extent cx="1617980" cy="1212850"/>
-                  <wp:effectExtent l="0" t="0" r="1270" b="6350"/>
+                  <wp:extent cx="1528445" cy="1146810"/>
+                  <wp:effectExtent l="0" t="0" r="14605" b="15240"/>
                   <wp:docPr id="2" name="Picture 2"/>
                   <wp:cNvGraphicFramePr>
                     <a:graphicFrameLocks xmlns:a="http://schemas.openxmlformats.org/drawingml/2006/main" noChangeAspect="1"/>
@@ -293,7 +329,7 @@
                         <pic:spPr>
                           <a:xfrm>
                             <a:off x="0" y="0"/>
-                            <a:ext cx="1618488" cy="1213104"/>
+                            <a:ext cx="1528445" cy="1146810"/>
                           </a:xfrm>
                           <a:prstGeom prst="rect">
                             <a:avLst/>
@@ -320,37 +356,17 @@
         </w:tc>
         <w:tc>
           <w:tcPr>
-            <w:tcW w:w="2766" w:type="dxa"/>
+            <w:tcW w:w="2546" w:type="dxa"/>
           </w:tcPr>
           <w:p>
             <w:pPr>
               <w:jc w:val="center"/>
             </w:pPr>
-            <w:bookmarkStart w:id="0" w:name="_GoBack"/>
-            <w:bookmarkEnd w:id="0"/>
           </w:p>
         </w:tc>
         <w:tc>
           <w:tcPr>
-            <w:tcW w:w="1384" w:type="dxa"/>
-          </w:tcPr>
-          <w:p>
-            <w:pPr>
-              <w:jc w:val="center"/>
-            </w:pPr>
-            <w:r>
-              <w:rPr>
-                <w:rFonts w:ascii="宋体" w:hAnsi="宋体" w:eastAsia="宋体"/>
-                <w:color w:val="0000FF"/>
-                <w:sz w:val="21"/>
-              </w:rPr>
-              <w:t>疑似空鼓: 1处</w:t>
-            </w:r>
-          </w:p>
-        </w:tc>
-        <w:tc>
-          <w:tcPr>
-            <w:tcW w:w="1414" w:type="dxa"/>
+            <w:tcW w:w="1090" w:type="dxa"/>
           </w:tcPr>
           <w:p>
             <w:pPr>
@@ -376,6 +392,74 @@
                 <w:sz w:val="21"/>
               </w:rPr>
               <w:t>38.6 m</w:t>
+            </w:r>
+          </w:p>
+        </w:tc>
+        <w:tc>
+          <w:tcPr>
+            <w:tcW w:w="1864" w:type="dxa"/>
+          </w:tcPr>
+          <w:p>
+            <w:pPr>
+              <w:jc w:val="center"/>
+            </w:pPr>
+            <w:r>
+              <w:rPr>
+                <w:rFonts w:ascii="宋体" w:hAnsi="宋体" w:eastAsia="宋体"/>
+                <w:color w:val="0000FF"/>
+                <w:sz w:val="21"/>
+              </w:rPr>
+              <w:t>疑似空鼓: 1处</w:t>
+            </w:r>
+          </w:p>
+        </w:tc>
+        <w:tc>
+          <w:tcPr>
+            <w:tcW w:w="1459" w:type="dxa"/>
+          </w:tcPr>
+          <w:p>
+            <w:pPr>
+              <w:jc w:val="center"/>
+              <w:rPr>
+                <w:rFonts w:ascii="宋体" w:hAnsi="宋体" w:eastAsia="宋体"/>
+                <w:sz w:val="21"/>
+              </w:rPr>
+            </w:pPr>
+            <w:r>
+              <w:rPr>
+                <w:rFonts w:hint="eastAsia" w:ascii="宋体" w:hAnsi="宋体" w:eastAsia="宋体"/>
+                <w:sz w:val="21"/>
+              </w:rPr>
+              <w:t>裂缝-002</w:t>
+            </w:r>
+            <w:r>
+              <w:rPr>
+                <w:rFonts w:hint="eastAsia" w:ascii="宋体" w:hAnsi="宋体" w:eastAsia="宋体"/>
+                <w:sz w:val="21"/>
+                <w:lang w:val="en-US" w:eastAsia="zh-CN"/>
+              </w:rPr>
+              <w:t>≈</w:t>
+            </w:r>
+            <w:r>
+              <w:rPr>
+                <w:rFonts w:hint="eastAsia" w:ascii="宋体" w:hAnsi="宋体" w:eastAsia="宋体"/>
+                <w:sz w:val="21"/>
+              </w:rPr>
+              <w:t>0.248</w:t>
+            </w:r>
+            <w:r>
+              <w:rPr>
+                <w:rFonts w:ascii="微软雅黑" w:hAnsi="微软雅黑" w:eastAsia="微软雅黑" w:cs="微软雅黑"/>
+                <w:i w:val="0"/>
+                <w:iCs w:val="0"/>
+                <w:caps w:val="0"/>
+                <w:color w:val="475467"/>
+                <w:spacing w:val="4"/>
+                <w:sz w:val="18"/>
+                <w:szCs w:val="18"/>
+                <w:shd w:val="clear" w:fill="FFFFFF"/>
+              </w:rPr>
+              <w:t>m²</w:t>
             </w:r>
           </w:p>
         </w:tc>
@@ -587,7 +671,7 @@
   <w:docDefaults>
     <w:rPrDefault>
       <w:rPr>
-        <w:rFonts w:asciiTheme="minorHAnsi" w:hAnsiTheme="minorHAnsi" w:eastAsiaTheme="minorEastAsia" w:cstheme="minorBidi"/>
+        <w:rFonts w:ascii="Times New Roman" w:hAnsi="Times New Roman" w:eastAsia="宋体" w:cs="Times New Roman"/>
       </w:rPr>
     </w:rPrDefault>
     <w:pPrDefault/>
@@ -625,7 +709,7 @@
     <w:lsdException w:uiPriority="99" w:name="footnote text"/>
     <w:lsdException w:uiPriority="99" w:name="annotation text"/>
     <w:lsdException w:uiPriority="99" w:semiHidden="0" w:name="header"/>
-    <w:lsdException w:uiPriority="99" w:semiHidden="0" w:name="footer"/>
+    <w:lsdException w:qFormat="1" w:uiPriority="99" w:semiHidden="0" w:name="footer"/>
     <w:lsdException w:uiPriority="99" w:name="index heading"/>
     <w:lsdException w:qFormat="1" w:uiPriority="35" w:name="caption"/>
     <w:lsdException w:uiPriority="99" w:name="table of figures"/>
@@ -638,32 +722,32 @@
     <w:lsdException w:uiPriority="99" w:name="endnote reference"/>
     <w:lsdException w:uiPriority="99" w:name="endnote text"/>
     <w:lsdException w:uiPriority="99" w:name="table of authorities"/>
-    <w:lsdException w:uiPriority="99" w:semiHidden="0" w:name="macro"/>
+    <w:lsdException w:qFormat="1" w:uiPriority="99" w:semiHidden="0" w:name="macro"/>
     <w:lsdException w:uiPriority="99" w:name="toa heading"/>
-    <w:lsdException w:uiPriority="99" w:semiHidden="0" w:name="List"/>
+    <w:lsdException w:qFormat="1" w:uiPriority="99" w:semiHidden="0" w:name="List"/>
     <w:lsdException w:uiPriority="99" w:semiHidden="0" w:name="List Bullet"/>
-    <w:lsdException w:uiPriority="99" w:semiHidden="0" w:name="List Number"/>
-    <w:lsdException w:uiPriority="99" w:semiHidden="0" w:name="List 2"/>
-    <w:lsdException w:uiPriority="99" w:semiHidden="0" w:name="List 3"/>
+    <w:lsdException w:qFormat="1" w:uiPriority="99" w:semiHidden="0" w:name="List Number"/>
+    <w:lsdException w:qFormat="1" w:uiPriority="99" w:semiHidden="0" w:name="List 2"/>
+    <w:lsdException w:qFormat="1" w:uiPriority="99" w:semiHidden="0" w:name="List 3"/>
     <w:lsdException w:uiPriority="99" w:name="List 4"/>
     <w:lsdException w:uiPriority="99" w:name="List 5"/>
-    <w:lsdException w:uiPriority="99" w:semiHidden="0" w:name="List Bullet 2"/>
-    <w:lsdException w:uiPriority="99" w:semiHidden="0" w:name="List Bullet 3"/>
+    <w:lsdException w:qFormat="1" w:uiPriority="99" w:semiHidden="0" w:name="List Bullet 2"/>
+    <w:lsdException w:qFormat="1" w:uiPriority="99" w:semiHidden="0" w:name="List Bullet 3"/>
     <w:lsdException w:uiPriority="99" w:name="List Bullet 4"/>
     <w:lsdException w:uiPriority="99" w:name="List Bullet 5"/>
-    <w:lsdException w:uiPriority="99" w:semiHidden="0" w:name="List Number 2"/>
-    <w:lsdException w:uiPriority="99" w:semiHidden="0" w:name="List Number 3"/>
+    <w:lsdException w:qFormat="1" w:uiPriority="99" w:semiHidden="0" w:name="List Number 2"/>
+    <w:lsdException w:qFormat="1" w:uiPriority="99" w:semiHidden="0" w:name="List Number 3"/>
     <w:lsdException w:uiPriority="99" w:name="List Number 4"/>
     <w:lsdException w:uiPriority="99" w:name="List Number 5"/>
     <w:lsdException w:qFormat="1" w:unhideWhenUsed="0" w:uiPriority="10" w:semiHidden="0" w:name="Title"/>
     <w:lsdException w:uiPriority="99" w:name="Closing"/>
     <w:lsdException w:uiPriority="99" w:name="Signature"/>
-    <w:lsdException w:uiPriority="1" w:name="Default Paragraph Font"/>
+    <w:lsdException w:qFormat="1" w:uiPriority="1" w:name="Default Paragraph Font"/>
     <w:lsdException w:uiPriority="99" w:semiHidden="0" w:name="Body Text"/>
     <w:lsdException w:uiPriority="99" w:name="Body Text Indent"/>
-    <w:lsdException w:uiPriority="99" w:semiHidden="0" w:name="List Continue"/>
+    <w:lsdException w:qFormat="1" w:uiPriority="99" w:semiHidden="0" w:name="List Continue"/>
     <w:lsdException w:uiPriority="99" w:semiHidden="0" w:name="List Continue 2"/>
-    <w:lsdException w:uiPriority="99" w:semiHidden="0" w:name="List Continue 3"/>
+    <w:lsdException w:qFormat="1" w:uiPriority="99" w:semiHidden="0" w:name="List Continue 3"/>
     <w:lsdException w:uiPriority="99" w:name="List Continue 4"/>
     <w:lsdException w:uiPriority="99" w:name="List Continue 5"/>
     <w:lsdException w:uiPriority="99" w:name="Message Header"/>
@@ -673,8 +757,8 @@
     <w:lsdException w:uiPriority="99" w:name="Body Text First Indent"/>
     <w:lsdException w:uiPriority="99" w:name="Body Text First Indent 2"/>
     <w:lsdException w:uiPriority="99" w:name="Note Heading"/>
-    <w:lsdException w:uiPriority="99" w:semiHidden="0" w:name="Body Text 2"/>
-    <w:lsdException w:uiPriority="99" w:semiHidden="0" w:name="Body Text 3"/>
+    <w:lsdException w:qFormat="1" w:uiPriority="99" w:semiHidden="0" w:name="Body Text 2"/>
+    <w:lsdException w:qFormat="1" w:uiPriority="99" w:semiHidden="0" w:name="Body Text 3"/>
     <w:lsdException w:uiPriority="99" w:name="Body Text Indent 2"/>
     <w:lsdException w:uiPriority="99" w:name="Body Text Indent 3"/>
     <w:lsdException w:uiPriority="99" w:name="Block Text"/>
@@ -696,7 +780,7 @@
     <w:lsdException w:uiPriority="99" w:name="HTML Sample"/>
     <w:lsdException w:uiPriority="99" w:name="HTML Typewriter"/>
     <w:lsdException w:uiPriority="99" w:name="HTML Variable"/>
-    <w:lsdException w:uiPriority="99" w:name="Normal Table"/>
+    <w:lsdException w:qFormat="1" w:uiPriority="99" w:name="Normal Table"/>
     <w:lsdException w:uiPriority="99" w:name="annotation subject"/>
     <w:lsdException w:uiPriority="99" w:name="Table Simple 1"/>
     <w:lsdException w:uiPriority="99" w:name="Table Simple 2"/>
@@ -744,7 +828,7 @@
     <w:lsdException w:qFormat="1" w:unhideWhenUsed="0" w:uiPriority="59" w:semiHidden="0" w:name="Table Grid"/>
     <w:lsdException w:uiPriority="99" w:name="Table Theme"/>
     <w:lsdException w:qFormat="1" w:unhideWhenUsed="0" w:uiPriority="1" w:semiHidden="0" w:name="No Spacing"/>
-    <w:lsdException w:unhideWhenUsed="0" w:uiPriority="60" w:semiHidden="0" w:name="Light Shading"/>
+    <w:lsdException w:qFormat="1" w:unhideWhenUsed="0" w:uiPriority="60" w:semiHidden="0" w:name="Light Shading"/>
     <w:lsdException w:unhideWhenUsed="0" w:uiPriority="61" w:semiHidden="0" w:name="Light List"/>
     <w:lsdException w:unhideWhenUsed="0" w:uiPriority="62" w:semiHidden="0" w:name="Light Grid"/>
     <w:lsdException w:unhideWhenUsed="0" w:uiPriority="63" w:semiHidden="0" w:name="Medium Shading 1"/>
@@ -759,7 +843,7 @@
     <w:lsdException w:qFormat="1" w:unhideWhenUsed="0" w:uiPriority="72" w:semiHidden="0" w:name="Colorful List"/>
     <w:lsdException w:qFormat="1" w:unhideWhenUsed="0" w:uiPriority="73" w:semiHidden="0" w:name="Colorful Grid"/>
     <w:lsdException w:unhideWhenUsed="0" w:uiPriority="60" w:semiHidden="0" w:name="Light Shading Accent 1"/>
-    <w:lsdException w:unhideWhenUsed="0" w:uiPriority="61" w:semiHidden="0" w:name="Light List Accent 1"/>
+    <w:lsdException w:qFormat="1" w:unhideWhenUsed="0" w:uiPriority="61" w:semiHidden="0" w:name="Light List Accent 1"/>
     <w:lsdException w:unhideWhenUsed="0" w:uiPriority="62" w:semiHidden="0" w:name="Light Grid Accent 1"/>
     <w:lsdException w:unhideWhenUsed="0" w:uiPriority="63" w:semiHidden="0" w:name="Medium Shading 1 Accent 1"/>
     <w:lsdException w:unhideWhenUsed="0" w:uiPriority="64" w:semiHidden="0" w:name="Medium Shading 2 Accent 1"/>
@@ -775,8 +859,8 @@
     <w:lsdException w:qFormat="1" w:unhideWhenUsed="0" w:uiPriority="71" w:semiHidden="0" w:name="Colorful Shading Accent 1"/>
     <w:lsdException w:qFormat="1" w:unhideWhenUsed="0" w:uiPriority="72" w:semiHidden="0" w:name="Colorful List Accent 1"/>
     <w:lsdException w:qFormat="1" w:unhideWhenUsed="0" w:uiPriority="73" w:semiHidden="0" w:name="Colorful Grid Accent 1"/>
-    <w:lsdException w:unhideWhenUsed="0" w:uiPriority="60" w:semiHidden="0" w:name="Light Shading Accent 2"/>
-    <w:lsdException w:unhideWhenUsed="0" w:uiPriority="61" w:semiHidden="0" w:name="Light List Accent 2"/>
+    <w:lsdException w:qFormat="1" w:unhideWhenUsed="0" w:uiPriority="60" w:semiHidden="0" w:name="Light Shading Accent 2"/>
+    <w:lsdException w:qFormat="1" w:unhideWhenUsed="0" w:uiPriority="61" w:semiHidden="0" w:name="Light List Accent 2"/>
     <w:lsdException w:unhideWhenUsed="0" w:uiPriority="62" w:semiHidden="0" w:name="Light Grid Accent 2"/>
     <w:lsdException w:unhideWhenUsed="0" w:uiPriority="63" w:semiHidden="0" w:name="Medium Shading 1 Accent 2"/>
     <w:lsdException w:unhideWhenUsed="0" w:uiPriority="64" w:semiHidden="0" w:name="Medium Shading 2 Accent 2"/>
@@ -789,8 +873,8 @@
     <w:lsdException w:qFormat="1" w:unhideWhenUsed="0" w:uiPriority="71" w:semiHidden="0" w:name="Colorful Shading Accent 2"/>
     <w:lsdException w:qFormat="1" w:unhideWhenUsed="0" w:uiPriority="72" w:semiHidden="0" w:name="Colorful List Accent 2"/>
     <w:lsdException w:qFormat="1" w:unhideWhenUsed="0" w:uiPriority="73" w:semiHidden="0" w:name="Colorful Grid Accent 2"/>
-    <w:lsdException w:unhideWhenUsed="0" w:uiPriority="60" w:semiHidden="0" w:name="Light Shading Accent 3"/>
-    <w:lsdException w:unhideWhenUsed="0" w:uiPriority="61" w:semiHidden="0" w:name="Light List Accent 3"/>
+    <w:lsdException w:qFormat="1" w:unhideWhenUsed="0" w:uiPriority="60" w:semiHidden="0" w:name="Light Shading Accent 3"/>
+    <w:lsdException w:qFormat="1" w:unhideWhenUsed="0" w:uiPriority="61" w:semiHidden="0" w:name="Light List Accent 3"/>
     <w:lsdException w:unhideWhenUsed="0" w:uiPriority="62" w:semiHidden="0" w:name="Light Grid Accent 3"/>
     <w:lsdException w:unhideWhenUsed="0" w:uiPriority="63" w:semiHidden="0" w:name="Medium Shading 1 Accent 3"/>
     <w:lsdException w:unhideWhenUsed="0" w:uiPriority="64" w:semiHidden="0" w:name="Medium Shading 2 Accent 3"/>
@@ -803,7 +887,7 @@
     <w:lsdException w:qFormat="1" w:unhideWhenUsed="0" w:uiPriority="71" w:semiHidden="0" w:name="Colorful Shading Accent 3"/>
     <w:lsdException w:qFormat="1" w:unhideWhenUsed="0" w:uiPriority="72" w:semiHidden="0" w:name="Colorful List Accent 3"/>
     <w:lsdException w:unhideWhenUsed="0" w:uiPriority="73" w:semiHidden="0" w:name="Colorful Grid Accent 3"/>
-    <w:lsdException w:unhideWhenUsed="0" w:uiPriority="60" w:semiHidden="0" w:name="Light Shading Accent 4"/>
+    <w:lsdException w:qFormat="1" w:unhideWhenUsed="0" w:uiPriority="60" w:semiHidden="0" w:name="Light Shading Accent 4"/>
     <w:lsdException w:unhideWhenUsed="0" w:uiPriority="61" w:semiHidden="0" w:name="Light List Accent 4"/>
     <w:lsdException w:unhideWhenUsed="0" w:uiPriority="62" w:semiHidden="0" w:name="Light Grid Accent 4"/>
     <w:lsdException w:unhideWhenUsed="0" w:uiPriority="63" w:semiHidden="0" w:name="Medium Shading 1 Accent 4"/>
@@ -832,7 +916,7 @@
     <w:lsdException w:qFormat="1" w:unhideWhenUsed="0" w:uiPriority="72" w:semiHidden="0" w:name="Colorful List Accent 5"/>
     <w:lsdException w:qFormat="1" w:unhideWhenUsed="0" w:uiPriority="73" w:semiHidden="0" w:name="Colorful Grid Accent 5"/>
     <w:lsdException w:unhideWhenUsed="0" w:uiPriority="60" w:semiHidden="0" w:name="Light Shading Accent 6"/>
-    <w:lsdException w:unhideWhenUsed="0" w:uiPriority="61" w:semiHidden="0" w:name="Light List Accent 6"/>
+    <w:lsdException w:qFormat="1" w:unhideWhenUsed="0" w:uiPriority="61" w:semiHidden="0" w:name="Light List Accent 6"/>
     <w:lsdException w:unhideWhenUsed="0" w:uiPriority="62" w:semiHidden="0" w:name="Light Grid Accent 6"/>
     <w:lsdException w:unhideWhenUsed="0" w:uiPriority="63" w:semiHidden="0" w:name="Medium Shading 1 Accent 6"/>
     <w:lsdException w:qFormat="1" w:unhideWhenUsed="0" w:uiPriority="64" w:semiHidden="0" w:name="Medium Shading 2 Accent 6"/>
@@ -1100,12 +1184,14 @@
     <w:name w:val="Default Paragraph Font"/>
     <w:semiHidden/>
     <w:unhideWhenUsed/>
+    <w:qFormat/>
     <w:uiPriority w:val="1"/>
   </w:style>
   <w:style w:type="table" w:default="1" w:styleId="32">
     <w:name w:val="Normal Table"/>
     <w:semiHidden/>
     <w:unhideWhenUsed/>
+    <w:qFormat/>
     <w:uiPriority w:val="99"/>
     <w:tblPr>
       <w:tblCellMar>
@@ -1120,6 +1206,7 @@
     <w:name w:val="macro"/>
     <w:link w:val="147"/>
     <w:unhideWhenUsed/>
+    <w:qFormat/>
     <w:uiPriority w:val="99"/>
     <w:pPr>
       <w:tabs>
@@ -1144,6 +1231,7 @@
     <w:name w:val="List 3"/>
     <w:basedOn w:val="1"/>
     <w:unhideWhenUsed/>
+    <w:qFormat/>
     <w:uiPriority w:val="99"/>
     <w:pPr>
       <w:ind w:left="1080" w:hanging="360"/>
@@ -1154,6 +1242,7 @@
     <w:name w:val="List Number 2"/>
     <w:basedOn w:val="1"/>
     <w:unhideWhenUsed/>
+    <w:qFormat/>
     <w:uiPriority w:val="99"/>
     <w:pPr>
       <w:numPr>
@@ -1167,6 +1256,7 @@
     <w:name w:val="List Number"/>
     <w:basedOn w:val="1"/>
     <w:unhideWhenUsed/>
+    <w:qFormat/>
     <w:uiPriority w:val="99"/>
     <w:pPr>
       <w:numPr>
@@ -1218,6 +1308,7 @@
     <w:basedOn w:val="1"/>
     <w:link w:val="146"/>
     <w:unhideWhenUsed/>
+    <w:qFormat/>
     <w:uiPriority w:val="99"/>
     <w:pPr>
       <w:spacing w:after="120"/>
@@ -1231,6 +1322,7 @@
     <w:name w:val="List Bullet 3"/>
     <w:basedOn w:val="1"/>
     <w:unhideWhenUsed/>
+    <w:qFormat/>
     <w:uiPriority w:val="99"/>
     <w:pPr>
       <w:numPr>
@@ -1254,6 +1346,7 @@
     <w:name w:val="List Number 3"/>
     <w:basedOn w:val="1"/>
     <w:unhideWhenUsed/>
+    <w:qFormat/>
     <w:uiPriority w:val="99"/>
     <w:pPr>
       <w:numPr>
@@ -1267,6 +1360,7 @@
     <w:name w:val="List 2"/>
     <w:basedOn w:val="1"/>
     <w:unhideWhenUsed/>
+    <w:qFormat/>
     <w:uiPriority w:val="99"/>
     <w:pPr>
       <w:ind w:left="720" w:hanging="360"/>
@@ -1277,6 +1371,7 @@
     <w:name w:val="List Continue"/>
     <w:basedOn w:val="1"/>
     <w:unhideWhenUsed/>
+    <w:qFormat/>
     <w:uiPriority w:val="99"/>
     <w:pPr>
       <w:spacing w:after="120"/>
@@ -1288,6 +1383,7 @@
     <w:name w:val="List Bullet 2"/>
     <w:basedOn w:val="1"/>
     <w:unhideWhenUsed/>
+    <w:qFormat/>
     <w:uiPriority w:val="99"/>
     <w:pPr>
       <w:numPr>
@@ -1302,6 +1398,7 @@
     <w:basedOn w:val="1"/>
     <w:link w:val="136"/>
     <w:unhideWhenUsed/>
+    <w:qFormat/>
     <w:uiPriority w:val="99"/>
     <w:pPr>
       <w:tabs>
@@ -1351,6 +1448,7 @@
     <w:name w:val="List"/>
     <w:basedOn w:val="1"/>
     <w:unhideWhenUsed/>
+    <w:qFormat/>
     <w:uiPriority w:val="99"/>
     <w:pPr>
       <w:ind w:left="360" w:hanging="360"/>
@@ -1362,6 +1460,7 @@
     <w:basedOn w:val="1"/>
     <w:link w:val="145"/>
     <w:unhideWhenUsed/>
+    <w:qFormat/>
     <w:uiPriority w:val="99"/>
     <w:pPr>
       <w:spacing w:after="120" w:line="480" w:lineRule="auto"/>
@@ -1382,6 +1481,7 @@
     <w:name w:val="List Continue 3"/>
     <w:basedOn w:val="1"/>
     <w:unhideWhenUsed/>
+    <w:qFormat/>
     <w:uiPriority w:val="99"/>
     <w:pPr>
       <w:spacing w:after="120"/>
@@ -1440,6 +1540,7 @@
   <w:style w:type="table" w:styleId="34">
     <w:name w:val="Light Shading"/>
     <w:basedOn w:val="32"/>
+    <w:qFormat/>
     <w:uiPriority w:val="60"/>
     <w:pPr>
       <w:spacing w:after="0" w:line="240" w:lineRule="auto"/>
@@ -1638,6 +1739,7 @@
   <w:style w:type="table" w:styleId="36">
     <w:name w:val="Light Shading Accent 2"/>
     <w:basedOn w:val="32"/>
+    <w:qFormat/>
     <w:uiPriority w:val="60"/>
     <w:pPr>
       <w:spacing w:after="0" w:line="240" w:lineRule="auto"/>
@@ -1737,6 +1839,7 @@
   <w:style w:type="table" w:styleId="37">
     <w:name w:val="Light Shading Accent 3"/>
     <w:basedOn w:val="32"/>
+    <w:qFormat/>
     <w:uiPriority w:val="60"/>
     <w:pPr>
       <w:spacing w:after="0" w:line="240" w:lineRule="auto"/>
@@ -1836,6 +1939,7 @@
   <w:style w:type="table" w:styleId="38">
     <w:name w:val="Light Shading Accent 4"/>
     <w:basedOn w:val="32"/>
+    <w:qFormat/>
     <w:uiPriority w:val="60"/>
     <w:pPr>
       <w:spacing w:after="0" w:line="240" w:lineRule="auto"/>
@@ -2226,6 +2330,7 @@
   <w:style w:type="table" w:styleId="42">
     <w:name w:val="Light List Accent 1"/>
     <w:basedOn w:val="32"/>
+    <w:qFormat/>
     <w:uiPriority w:val="61"/>
     <w:pPr>
       <w:spacing w:after="0" w:line="240" w:lineRule="auto"/>
@@ -2319,6 +2424,7 @@
   <w:style w:type="table" w:styleId="43">
     <w:name w:val="Light List Accent 2"/>
     <w:basedOn w:val="32"/>
+    <w:qFormat/>
     <w:uiPriority w:val="61"/>
     <w:pPr>
       <w:spacing w:after="0" w:line="240" w:lineRule="auto"/>
@@ -2412,6 +2518,7 @@
   <w:style w:type="table" w:styleId="44">
     <w:name w:val="Light List Accent 3"/>
     <w:basedOn w:val="32"/>
+    <w:qFormat/>
     <w:uiPriority w:val="61"/>
     <w:pPr>
       <w:spacing w:after="0" w:line="240" w:lineRule="auto"/>
@@ -2691,6 +2798,7 @@
   <w:style w:type="table" w:styleId="47">
     <w:name w:val="Light List Accent 6"/>
     <w:basedOn w:val="32"/>
+    <w:qFormat/>
     <w:uiPriority w:val="61"/>
     <w:pPr>
       <w:spacing w:after="0" w:line="240" w:lineRule="auto"/>
@@ -13184,6 +13292,7 @@
     <w:basedOn w:val="132"/>
     <w:link w:val="10"/>
     <w:semiHidden/>
+    <w:qFormat/>
     <w:uiPriority w:val="9"/>
     <w:rPr>
       <w:rFonts w:asciiTheme="majorHAnsi" w:hAnsiTheme="majorHAnsi" w:eastAsiaTheme="majorEastAsia" w:cstheme="majorBidi"/>

</xml_diff>